<commit_message>
Update LNI-Startseiten (corrected), rebuild proceedings.pdf
Co-Authored-By: Claude Sonnet 4.6 <noreply@anthropic.com>
</commit_message>
<xml_diff>
--- a/LNI-Startseiten.docx
+++ b/LNI-Startseiten.docx
@@ -1,6 +1,6 @@
 
 <file path=word/document.xml><?xml version="1.0" encoding="utf-8"?>
-<w:document xmlns:wpc="http://schemas.microsoft.com/office/word/2010/wordprocessingCanvas" xmlns:cx="http://schemas.microsoft.com/office/drawing/2014/chartex" xmlns:cx1="http://schemas.microsoft.com/office/drawing/2015/9/8/chartex" xmlns:cx2="http://schemas.microsoft.com/office/drawing/2015/10/21/chartex" xmlns:cx3="http://schemas.microsoft.com/office/drawing/2016/5/9/chartex" xmlns:cx4="http://schemas.microsoft.com/office/drawing/2016/5/10/chartex" xmlns:cx5="http://schemas.microsoft.com/office/drawing/2016/5/11/chartex" xmlns:cx6="http://schemas.microsoft.com/office/drawing/2016/5/12/chartex" xmlns:cx7="http://schemas.microsoft.com/office/drawing/2016/5/13/chartex" xmlns:cx8="http://schemas.microsoft.com/office/drawing/2016/5/14/chartex" xmlns:mc="http://schemas.openxmlformats.org/markup-compatibility/2006" xmlns:aink="http://schemas.microsoft.com/office/drawing/2016/ink" xmlns:am3d="http://schemas.microsoft.com/office/drawing/2017/model3d" xmlns:o="urn:schemas-microsoft-com:office:office" xmlns:oel="http://schemas.microsoft.com/office/2019/extlst" xmlns:r="http://schemas.openxmlformats.org/officeDocument/2006/relationships" xmlns:m="http://schemas.openxmlformats.org/officeDocument/2006/math" xmlns:v="urn:schemas-microsoft-com:vml" xmlns:wp14="http://schemas.microsoft.com/office/word/2010/wordprocessingDrawing" xmlns:wp="http://schemas.openxmlformats.org/drawingml/2006/wordprocessingDrawing" xmlns:w10="urn:schemas-microsoft-com:office:word" xmlns:w="http://schemas.openxmlformats.org/wordprocessingml/2006/main" xmlns:w14="http://schemas.microsoft.com/office/word/2010/wordml" xmlns:w15="http://schemas.microsoft.com/office/word/2012/wordml" xmlns:w16cex="http://schemas.microsoft.com/office/word/2018/wordml/cex" xmlns:w16cid="http://schemas.microsoft.com/office/word/2016/wordml/cid" xmlns:w16="http://schemas.microsoft.com/office/word/2018/wordml" xmlns:w16du="http://schemas.microsoft.com/office/word/2023/wordml/word16du" xmlns:w16sdtdh="http://schemas.microsoft.com/office/word/2020/wordml/sdtdatahash" xmlns:w16sdtfl="http://schemas.microsoft.com/office/word/2024/wordml/sdtformatlock" xmlns:w16se="http://schemas.microsoft.com/office/word/2015/wordml/symex" xmlns:wpg="http://schemas.microsoft.com/office/word/2010/wordprocessingGroup" xmlns:wpi="http://schemas.microsoft.com/office/word/2010/wordprocessingInk" xmlns:wne="http://schemas.microsoft.com/office/word/2006/wordml" xmlns:wps="http://schemas.microsoft.com/office/word/2010/wordprocessingShape" mc:Ignorable="w14 w15 w16se w16cid w16 w16cex w16sdtdh w16sdtfl w16du wp14">
+<w:document xmlns:wpc="http://schemas.microsoft.com/office/word/2010/wordprocessingCanvas" xmlns:cx="http://schemas.microsoft.com/office/drawing/2014/chartex" xmlns:cx1="http://schemas.microsoft.com/office/drawing/2015/9/8/chartex" xmlns:cx2="http://schemas.microsoft.com/office/drawing/2015/10/21/chartex" xmlns:cx3="http://schemas.microsoft.com/office/drawing/2016/5/9/chartex" xmlns:cx4="http://schemas.microsoft.com/office/drawing/2016/5/10/chartex" xmlns:cx5="http://schemas.microsoft.com/office/drawing/2016/5/11/chartex" xmlns:cx6="http://schemas.microsoft.com/office/drawing/2016/5/12/chartex" xmlns:cx7="http://schemas.microsoft.com/office/drawing/2016/5/13/chartex" xmlns:cx8="http://schemas.microsoft.com/office/drawing/2016/5/14/chartex" xmlns:mc="http://schemas.openxmlformats.org/markup-compatibility/2006" xmlns:aink="http://schemas.microsoft.com/office/drawing/2016/ink" xmlns:am3d="http://schemas.microsoft.com/office/drawing/2017/model3d" xmlns:o="urn:schemas-microsoft-com:office:office" xmlns:r="http://schemas.openxmlformats.org/officeDocument/2006/relationships" xmlns:m="http://schemas.openxmlformats.org/officeDocument/2006/math" xmlns:v="urn:schemas-microsoft-com:vml" xmlns:wp14="http://schemas.microsoft.com/office/word/2010/wordprocessingDrawing" xmlns:wp="http://schemas.openxmlformats.org/drawingml/2006/wordprocessingDrawing" xmlns:w10="urn:schemas-microsoft-com:office:word" xmlns:w="http://schemas.openxmlformats.org/wordprocessingml/2006/main" xmlns:w14="http://schemas.microsoft.com/office/word/2010/wordml" xmlns:w15="http://schemas.microsoft.com/office/word/2012/wordml" xmlns:w16cid="http://schemas.microsoft.com/office/word/2016/wordml/cid" xmlns:w16se="http://schemas.microsoft.com/office/word/2015/wordml/symex" xmlns:wpg="http://schemas.microsoft.com/office/word/2010/wordprocessingGroup" xmlns:wpi="http://schemas.microsoft.com/office/word/2010/wordprocessingInk" xmlns:wne="http://schemas.microsoft.com/office/word/2006/wordml" xmlns:wps="http://schemas.microsoft.com/office/word/2010/wordprocessingShape" mc:Ignorable="w14 w15 w16se w16cid wp14">
   <w:body>
     <w:p>
       <w:pPr>
@@ -532,8 +532,17 @@
           <w:color w:val="auto"/>
           <w:lang w:val="de-AT"/>
         </w:rPr>
-        <w:t>- Poland</w:t>
-      </w:r>
+        <w:t xml:space="preserve">- </w:t>
+      </w:r>
+      <w:proofErr w:type="spellStart"/>
+      <w:r>
+        <w:rPr>
+          <w:color w:val="auto"/>
+          <w:lang w:val="de-AT"/>
+        </w:rPr>
+        <w:t>Poland</w:t>
+      </w:r>
+      <w:proofErr w:type="spellEnd"/>
     </w:p>
     <w:p>
       <w:pPr>
@@ -940,12 +949,21 @@
                 <w:tab w:val="left" w:pos="142"/>
               </w:tabs>
             </w:pPr>
+            <w:proofErr w:type="spellStart"/>
             <w:r>
               <w:rPr>
                 <w:kern w:val="2"/>
                 <w14:ligatures w14:val="standardContextual"/>
               </w:rPr>
-              <w:t>Małgorzata Burchard-</w:t>
+              <w:t>Małgorzata</w:t>
+            </w:r>
+            <w:proofErr w:type="spellEnd"/>
+            <w:r>
+              <w:rPr>
+                <w:kern w:val="2"/>
+                <w14:ligatures w14:val="standardContextual"/>
+              </w:rPr>
+              <w:t xml:space="preserve"> Burchard-</w:t>
             </w:r>
             <w:proofErr w:type="spellStart"/>
             <w:r>
@@ -1041,17 +1059,37 @@
     <w:p>
       <w:pPr>
         <w:pStyle w:val="Textkrper-Einzug2"/>
-      </w:pPr>
-      <w:r>
-        <w:t xml:space="preserve">Andreas Oberweis, KIT </w:t>
-      </w:r>
-      <w:proofErr w:type="gramStart"/>
-      <w:r>
-        <w:t>Karlsruhe,  (</w:t>
-      </w:r>
-      <w:proofErr w:type="gramEnd"/>
-      <w:r>
-        <w:t>Chairman, andreas.oberweis@kit.edu)</w:t>
+        <w:rPr>
+          <w:lang w:val="de-DE"/>
+        </w:rPr>
+      </w:pPr>
+      <w:r>
+        <w:rPr>
+          <w:lang w:val="de-DE"/>
+        </w:rPr>
+        <w:t xml:space="preserve">Andreas </w:t>
+      </w:r>
+      <w:proofErr w:type="spellStart"/>
+      <w:r>
+        <w:rPr>
+          <w:lang w:val="de-DE"/>
+        </w:rPr>
+        <w:t>Oberweis</w:t>
+      </w:r>
+      <w:proofErr w:type="spellEnd"/>
+      <w:r>
+        <w:rPr>
+          <w:lang w:val="de-DE"/>
+        </w:rPr>
+        <w:t xml:space="preserve">, KIT Karlsruhe, </w:t>
+      </w:r>
+      <w:bookmarkStart w:id="1" w:name="_GoBack"/>
+      <w:bookmarkEnd w:id="1"/>
+      <w:r>
+        <w:rPr>
+          <w:lang w:val="de-DE"/>
+        </w:rPr>
+        <w:t>(Chairman, andreas.oberweis@kit.edu)</w:t>
       </w:r>
     </w:p>
     <w:p>
@@ -1068,7 +1106,21 @@
         <w:rPr>
           <w:lang w:val="de-DE"/>
         </w:rPr>
-        <w:t>Torsten Brinda, Universität Duisburg-Essen, Germany</w:t>
+        <w:t xml:space="preserve">Torsten </w:t>
+      </w:r>
+      <w:proofErr w:type="spellStart"/>
+      <w:r>
+        <w:rPr>
+          <w:lang w:val="de-DE"/>
+        </w:rPr>
+        <w:t>Brinda</w:t>
+      </w:r>
+      <w:proofErr w:type="spellEnd"/>
+      <w:r>
+        <w:rPr>
+          <w:lang w:val="de-DE"/>
+        </w:rPr>
+        <w:t>, Universität Duisburg-Essen, Germany</w:t>
       </w:r>
     </w:p>
     <w:p>
@@ -1431,7 +1483,13 @@
         <w:rPr>
           <w:lang w:val="de-DE"/>
         </w:rPr>
-        <w:t xml:space="preserve"> Gesellschaft für Informatik, Bonn 2025</w:t>
+        <w:t xml:space="preserve"> Gesellschaft für Informatik, Bonn 202</w:t>
+      </w:r>
+      <w:r>
+        <w:rPr>
+          <w:lang w:val="de-DE"/>
+        </w:rPr>
+        <w:t>6</w:t>
       </w:r>
     </w:p>
     <w:p>
@@ -2480,7 +2538,7 @@
                 <w14:ligatures w14:val="standardContextual"/>
               </w:rPr>
             </w:pPr>
-            <w:bookmarkStart w:id="1" w:name="_Hlk187771491"/>
+            <w:bookmarkStart w:id="2" w:name="_Hlk187771491"/>
             <w:r>
               <w:rPr>
                 <w:kern w:val="2"/>
@@ -2669,12 +2727,21 @@
                 <w14:ligatures w14:val="standardContextual"/>
               </w:rPr>
             </w:pPr>
+            <w:proofErr w:type="spellStart"/>
             <w:r>
               <w:rPr>
                 <w:kern w:val="2"/>
                 <w14:ligatures w14:val="standardContextual"/>
               </w:rPr>
-              <w:t>Małgorzata Burchard-</w:t>
+              <w:t>Małgorzata</w:t>
+            </w:r>
+            <w:proofErr w:type="spellEnd"/>
+            <w:r>
+              <w:rPr>
+                <w:kern w:val="2"/>
+                <w14:ligatures w14:val="standardContextual"/>
+              </w:rPr>
+              <w:t xml:space="preserve"> Burchard-</w:t>
             </w:r>
             <w:proofErr w:type="spellStart"/>
             <w:r>
@@ -2779,7 +2846,7 @@
           </w:p>
         </w:tc>
       </w:tr>
-      <w:bookmarkEnd w:id="1"/>
+      <w:bookmarkEnd w:id="2"/>
     </w:tbl>
     <w:p>
       <w:pPr>
@@ -2856,10 +2923,18 @@
         <w:jc w:val="both"/>
       </w:pPr>
       <w:r>
-        <w:t xml:space="preserve">Andreas Abecker, </w:t>
+        <w:t xml:space="preserve">Andreas </w:t>
       </w:r>
       <w:proofErr w:type="spellStart"/>
       <w:r>
+        <w:t>Abecker</w:t>
+      </w:r>
+      <w:proofErr w:type="spellEnd"/>
+      <w:r>
+        <w:t xml:space="preserve">, </w:t>
+      </w:r>
+      <w:proofErr w:type="spellStart"/>
+      <w:r>
         <w:t>Disy</w:t>
       </w:r>
       <w:proofErr w:type="spellEnd"/>
@@ -2888,10 +2963,18 @@
         <w:jc w:val="both"/>
       </w:pPr>
       <w:r>
-        <w:t xml:space="preserve">Anna Zagorski, </w:t>
+        <w:t xml:space="preserve">Anna </w:t>
       </w:r>
       <w:proofErr w:type="spellStart"/>
       <w:r>
+        <w:t>Zagorski</w:t>
+      </w:r>
+      <w:proofErr w:type="spellEnd"/>
+      <w:r>
+        <w:t xml:space="preserve">, </w:t>
+      </w:r>
+      <w:proofErr w:type="spellStart"/>
+      <w:r>
         <w:t>Umweltbundesamt</w:t>
       </w:r>
       <w:proofErr w:type="spellEnd"/>
@@ -2915,12 +2998,10 @@
         <w:t xml:space="preserve">Benjamin Wagner </w:t>
       </w:r>
       <w:proofErr w:type="spellStart"/>
-      <w:proofErr w:type="gramStart"/>
       <w:r>
         <w:t>vom</w:t>
       </w:r>
       <w:proofErr w:type="spellEnd"/>
-      <w:proofErr w:type="gramEnd"/>
       <w:r>
         <w:t xml:space="preserve"> Berg, University of Applied Sciences Bremerhaven, Germany</w:t>
       </w:r>
@@ -3068,10 +3149,18 @@
         <w:jc w:val="both"/>
       </w:pPr>
       <w:r>
-        <w:t xml:space="preserve">Karol Mrozik, </w:t>
+        <w:t xml:space="preserve">Karol </w:t>
       </w:r>
       <w:proofErr w:type="spellStart"/>
       <w:r>
+        <w:t>Mrozik</w:t>
+      </w:r>
+      <w:proofErr w:type="spellEnd"/>
+      <w:r>
+        <w:t xml:space="preserve">, </w:t>
+      </w:r>
+      <w:proofErr w:type="spellStart"/>
+      <w:r>
         <w:t>Poznań</w:t>
       </w:r>
       <w:proofErr w:type="spellEnd"/>
@@ -3171,8 +3260,21 @@
       <w:pPr>
         <w:jc w:val="both"/>
       </w:pPr>
-      <w:r>
-        <w:t xml:space="preserve">Stanisław Czaja, </w:t>
+      <w:proofErr w:type="spellStart"/>
+      <w:r>
+        <w:t>Stanisław</w:t>
+      </w:r>
+      <w:proofErr w:type="spellEnd"/>
+      <w:r>
+        <w:t xml:space="preserve"> </w:t>
+      </w:r>
+      <w:proofErr w:type="spellStart"/>
+      <w:r>
+        <w:t>Czaja</w:t>
+      </w:r>
+      <w:proofErr w:type="spellEnd"/>
+      <w:r>
+        <w:t xml:space="preserve">, </w:t>
       </w:r>
       <w:proofErr w:type="spellStart"/>
       <w:r>
@@ -3370,12 +3472,21 @@
                 <w:lang w:val="de-DE"/>
               </w:rPr>
             </w:pPr>
+            <w:proofErr w:type="spellStart"/>
             <w:r>
               <w:rPr>
                 <w:szCs w:val="24"/>
                 <w:lang w:val="de-DE"/>
               </w:rPr>
-              <w:t>Małgorzata Burchard-</w:t>
+              <w:t>Małgorzata</w:t>
+            </w:r>
+            <w:proofErr w:type="spellEnd"/>
+            <w:r>
+              <w:rPr>
+                <w:szCs w:val="24"/>
+                <w:lang w:val="de-DE"/>
+              </w:rPr>
+              <w:t xml:space="preserve"> Burchard-</w:t>
             </w:r>
             <w:proofErr w:type="spellStart"/>
             <w:r>
@@ -3563,7 +3674,7 @@
 </file>
 
 <file path=word/endnotes.xml><?xml version="1.0" encoding="utf-8"?>
-<w:endnotes xmlns:wpc="http://schemas.microsoft.com/office/word/2010/wordprocessingCanvas" xmlns:cx="http://schemas.microsoft.com/office/drawing/2014/chartex" xmlns:cx1="http://schemas.microsoft.com/office/drawing/2015/9/8/chartex" xmlns:cx2="http://schemas.microsoft.com/office/drawing/2015/10/21/chartex" xmlns:cx3="http://schemas.microsoft.com/office/drawing/2016/5/9/chartex" xmlns:cx4="http://schemas.microsoft.com/office/drawing/2016/5/10/chartex" xmlns:cx5="http://schemas.microsoft.com/office/drawing/2016/5/11/chartex" xmlns:cx6="http://schemas.microsoft.com/office/drawing/2016/5/12/chartex" xmlns:cx7="http://schemas.microsoft.com/office/drawing/2016/5/13/chartex" xmlns:cx8="http://schemas.microsoft.com/office/drawing/2016/5/14/chartex" xmlns:mc="http://schemas.openxmlformats.org/markup-compatibility/2006" xmlns:aink="http://schemas.microsoft.com/office/drawing/2016/ink" xmlns:am3d="http://schemas.microsoft.com/office/drawing/2017/model3d" xmlns:o="urn:schemas-microsoft-com:office:office" xmlns:oel="http://schemas.microsoft.com/office/2019/extlst" xmlns:r="http://schemas.openxmlformats.org/officeDocument/2006/relationships" xmlns:m="http://schemas.openxmlformats.org/officeDocument/2006/math" xmlns:v="urn:schemas-microsoft-com:vml" xmlns:wp14="http://schemas.microsoft.com/office/word/2010/wordprocessingDrawing" xmlns:wp="http://schemas.openxmlformats.org/drawingml/2006/wordprocessingDrawing" xmlns:w10="urn:schemas-microsoft-com:office:word" xmlns:w="http://schemas.openxmlformats.org/wordprocessingml/2006/main" xmlns:w14="http://schemas.microsoft.com/office/word/2010/wordml" xmlns:w15="http://schemas.microsoft.com/office/word/2012/wordml" xmlns:w16cex="http://schemas.microsoft.com/office/word/2018/wordml/cex" xmlns:w16cid="http://schemas.microsoft.com/office/word/2016/wordml/cid" xmlns:w16="http://schemas.microsoft.com/office/word/2018/wordml" xmlns:w16du="http://schemas.microsoft.com/office/word/2023/wordml/word16du" xmlns:w16sdtdh="http://schemas.microsoft.com/office/word/2020/wordml/sdtdatahash" xmlns:w16sdtfl="http://schemas.microsoft.com/office/word/2024/wordml/sdtformatlock" xmlns:w16se="http://schemas.microsoft.com/office/word/2015/wordml/symex" xmlns:wpg="http://schemas.microsoft.com/office/word/2010/wordprocessingGroup" xmlns:wpi="http://schemas.microsoft.com/office/word/2010/wordprocessingInk" xmlns:wne="http://schemas.microsoft.com/office/word/2006/wordml" xmlns:wps="http://schemas.microsoft.com/office/word/2010/wordprocessingShape" mc:Ignorable="w14 w15 w16se w16cid w16 w16cex w16sdtdh w16sdtfl w16du wp14">
+<w:endnotes xmlns:wpc="http://schemas.microsoft.com/office/word/2010/wordprocessingCanvas" xmlns:cx="http://schemas.microsoft.com/office/drawing/2014/chartex" xmlns:cx1="http://schemas.microsoft.com/office/drawing/2015/9/8/chartex" xmlns:cx2="http://schemas.microsoft.com/office/drawing/2015/10/21/chartex" xmlns:cx3="http://schemas.microsoft.com/office/drawing/2016/5/9/chartex" xmlns:cx4="http://schemas.microsoft.com/office/drawing/2016/5/10/chartex" xmlns:cx5="http://schemas.microsoft.com/office/drawing/2016/5/11/chartex" xmlns:cx6="http://schemas.microsoft.com/office/drawing/2016/5/12/chartex" xmlns:cx7="http://schemas.microsoft.com/office/drawing/2016/5/13/chartex" xmlns:cx8="http://schemas.microsoft.com/office/drawing/2016/5/14/chartex" xmlns:mc="http://schemas.openxmlformats.org/markup-compatibility/2006" xmlns:aink="http://schemas.microsoft.com/office/drawing/2016/ink" xmlns:am3d="http://schemas.microsoft.com/office/drawing/2017/model3d" xmlns:o="urn:schemas-microsoft-com:office:office" xmlns:r="http://schemas.openxmlformats.org/officeDocument/2006/relationships" xmlns:m="http://schemas.openxmlformats.org/officeDocument/2006/math" xmlns:v="urn:schemas-microsoft-com:vml" xmlns:wp14="http://schemas.microsoft.com/office/word/2010/wordprocessingDrawing" xmlns:wp="http://schemas.openxmlformats.org/drawingml/2006/wordprocessingDrawing" xmlns:w10="urn:schemas-microsoft-com:office:word" xmlns:w="http://schemas.openxmlformats.org/wordprocessingml/2006/main" xmlns:w14="http://schemas.microsoft.com/office/word/2010/wordml" xmlns:w15="http://schemas.microsoft.com/office/word/2012/wordml" xmlns:w16cid="http://schemas.microsoft.com/office/word/2016/wordml/cid" xmlns:w16se="http://schemas.microsoft.com/office/word/2015/wordml/symex" xmlns:wpg="http://schemas.microsoft.com/office/word/2010/wordprocessingGroup" xmlns:wpi="http://schemas.microsoft.com/office/word/2010/wordprocessingInk" xmlns:wne="http://schemas.microsoft.com/office/word/2006/wordml" xmlns:wps="http://schemas.microsoft.com/office/word/2010/wordprocessingShape" mc:Ignorable="w14 w15 w16se w16cid wp14">
   <w:endnote w:type="separator" w:id="-1">
     <w:p>
       <w:r>
@@ -3582,7 +3693,7 @@
 </file>
 
 <file path=word/footnotes.xml><?xml version="1.0" encoding="utf-8"?>
-<w:footnotes xmlns:wpc="http://schemas.microsoft.com/office/word/2010/wordprocessingCanvas" xmlns:cx="http://schemas.microsoft.com/office/drawing/2014/chartex" xmlns:cx1="http://schemas.microsoft.com/office/drawing/2015/9/8/chartex" xmlns:cx2="http://schemas.microsoft.com/office/drawing/2015/10/21/chartex" xmlns:cx3="http://schemas.microsoft.com/office/drawing/2016/5/9/chartex" xmlns:cx4="http://schemas.microsoft.com/office/drawing/2016/5/10/chartex" xmlns:cx5="http://schemas.microsoft.com/office/drawing/2016/5/11/chartex" xmlns:cx6="http://schemas.microsoft.com/office/drawing/2016/5/12/chartex" xmlns:cx7="http://schemas.microsoft.com/office/drawing/2016/5/13/chartex" xmlns:cx8="http://schemas.microsoft.com/office/drawing/2016/5/14/chartex" xmlns:mc="http://schemas.openxmlformats.org/markup-compatibility/2006" xmlns:aink="http://schemas.microsoft.com/office/drawing/2016/ink" xmlns:am3d="http://schemas.microsoft.com/office/drawing/2017/model3d" xmlns:o="urn:schemas-microsoft-com:office:office" xmlns:oel="http://schemas.microsoft.com/office/2019/extlst" xmlns:r="http://schemas.openxmlformats.org/officeDocument/2006/relationships" xmlns:m="http://schemas.openxmlformats.org/officeDocument/2006/math" xmlns:v="urn:schemas-microsoft-com:vml" xmlns:wp14="http://schemas.microsoft.com/office/word/2010/wordprocessingDrawing" xmlns:wp="http://schemas.openxmlformats.org/drawingml/2006/wordprocessingDrawing" xmlns:w10="urn:schemas-microsoft-com:office:word" xmlns:w="http://schemas.openxmlformats.org/wordprocessingml/2006/main" xmlns:w14="http://schemas.microsoft.com/office/word/2010/wordml" xmlns:w15="http://schemas.microsoft.com/office/word/2012/wordml" xmlns:w16cex="http://schemas.microsoft.com/office/word/2018/wordml/cex" xmlns:w16cid="http://schemas.microsoft.com/office/word/2016/wordml/cid" xmlns:w16="http://schemas.microsoft.com/office/word/2018/wordml" xmlns:w16du="http://schemas.microsoft.com/office/word/2023/wordml/word16du" xmlns:w16sdtdh="http://schemas.microsoft.com/office/word/2020/wordml/sdtdatahash" xmlns:w16sdtfl="http://schemas.microsoft.com/office/word/2024/wordml/sdtformatlock" xmlns:w16se="http://schemas.microsoft.com/office/word/2015/wordml/symex" xmlns:wpg="http://schemas.microsoft.com/office/word/2010/wordprocessingGroup" xmlns:wpi="http://schemas.microsoft.com/office/word/2010/wordprocessingInk" xmlns:wne="http://schemas.microsoft.com/office/word/2006/wordml" xmlns:wps="http://schemas.microsoft.com/office/word/2010/wordprocessingShape" mc:Ignorable="w14 w15 w16se w16cid w16 w16cex w16sdtdh w16sdtfl w16du wp14">
+<w:footnotes xmlns:wpc="http://schemas.microsoft.com/office/word/2010/wordprocessingCanvas" xmlns:cx="http://schemas.microsoft.com/office/drawing/2014/chartex" xmlns:cx1="http://schemas.microsoft.com/office/drawing/2015/9/8/chartex" xmlns:cx2="http://schemas.microsoft.com/office/drawing/2015/10/21/chartex" xmlns:cx3="http://schemas.microsoft.com/office/drawing/2016/5/9/chartex" xmlns:cx4="http://schemas.microsoft.com/office/drawing/2016/5/10/chartex" xmlns:cx5="http://schemas.microsoft.com/office/drawing/2016/5/11/chartex" xmlns:cx6="http://schemas.microsoft.com/office/drawing/2016/5/12/chartex" xmlns:cx7="http://schemas.microsoft.com/office/drawing/2016/5/13/chartex" xmlns:cx8="http://schemas.microsoft.com/office/drawing/2016/5/14/chartex" xmlns:mc="http://schemas.openxmlformats.org/markup-compatibility/2006" xmlns:aink="http://schemas.microsoft.com/office/drawing/2016/ink" xmlns:am3d="http://schemas.microsoft.com/office/drawing/2017/model3d" xmlns:o="urn:schemas-microsoft-com:office:office" xmlns:r="http://schemas.openxmlformats.org/officeDocument/2006/relationships" xmlns:m="http://schemas.openxmlformats.org/officeDocument/2006/math" xmlns:v="urn:schemas-microsoft-com:vml" xmlns:wp14="http://schemas.microsoft.com/office/word/2010/wordprocessingDrawing" xmlns:wp="http://schemas.openxmlformats.org/drawingml/2006/wordprocessingDrawing" xmlns:w10="urn:schemas-microsoft-com:office:word" xmlns:w="http://schemas.openxmlformats.org/wordprocessingml/2006/main" xmlns:w14="http://schemas.microsoft.com/office/word/2010/wordml" xmlns:w15="http://schemas.microsoft.com/office/word/2012/wordml" xmlns:w16cid="http://schemas.microsoft.com/office/word/2016/wordml/cid" xmlns:w16se="http://schemas.microsoft.com/office/word/2015/wordml/symex" xmlns:wpg="http://schemas.microsoft.com/office/word/2010/wordprocessingGroup" xmlns:wpi="http://schemas.microsoft.com/office/word/2010/wordprocessingInk" xmlns:wne="http://schemas.microsoft.com/office/word/2006/wordml" xmlns:wps="http://schemas.microsoft.com/office/word/2010/wordprocessingShape" mc:Ignorable="w14 w15 w16se w16cid wp14">
   <w:footnote w:type="separator" w:id="-1">
     <w:p>
       <w:r>
@@ -3601,7 +3712,7 @@
 </file>
 
 <file path=word/header1.xml><?xml version="1.0" encoding="utf-8"?>
-<w:hdr xmlns:wpc="http://schemas.microsoft.com/office/word/2010/wordprocessingCanvas" xmlns:cx="http://schemas.microsoft.com/office/drawing/2014/chartex" xmlns:cx1="http://schemas.microsoft.com/office/drawing/2015/9/8/chartex" xmlns:cx2="http://schemas.microsoft.com/office/drawing/2015/10/21/chartex" xmlns:cx3="http://schemas.microsoft.com/office/drawing/2016/5/9/chartex" xmlns:cx4="http://schemas.microsoft.com/office/drawing/2016/5/10/chartex" xmlns:cx5="http://schemas.microsoft.com/office/drawing/2016/5/11/chartex" xmlns:cx6="http://schemas.microsoft.com/office/drawing/2016/5/12/chartex" xmlns:cx7="http://schemas.microsoft.com/office/drawing/2016/5/13/chartex" xmlns:cx8="http://schemas.microsoft.com/office/drawing/2016/5/14/chartex" xmlns:mc="http://schemas.openxmlformats.org/markup-compatibility/2006" xmlns:aink="http://schemas.microsoft.com/office/drawing/2016/ink" xmlns:am3d="http://schemas.microsoft.com/office/drawing/2017/model3d" xmlns:o="urn:schemas-microsoft-com:office:office" xmlns:oel="http://schemas.microsoft.com/office/2019/extlst" xmlns:r="http://schemas.openxmlformats.org/officeDocument/2006/relationships" xmlns:m="http://schemas.openxmlformats.org/officeDocument/2006/math" xmlns:v="urn:schemas-microsoft-com:vml" xmlns:wp14="http://schemas.microsoft.com/office/word/2010/wordprocessingDrawing" xmlns:wp="http://schemas.openxmlformats.org/drawingml/2006/wordprocessingDrawing" xmlns:w10="urn:schemas-microsoft-com:office:word" xmlns:w="http://schemas.openxmlformats.org/wordprocessingml/2006/main" xmlns:w14="http://schemas.microsoft.com/office/word/2010/wordml" xmlns:w15="http://schemas.microsoft.com/office/word/2012/wordml" xmlns:w16cex="http://schemas.microsoft.com/office/word/2018/wordml/cex" xmlns:w16cid="http://schemas.microsoft.com/office/word/2016/wordml/cid" xmlns:w16="http://schemas.microsoft.com/office/word/2018/wordml" xmlns:w16du="http://schemas.microsoft.com/office/word/2023/wordml/word16du" xmlns:w16sdtdh="http://schemas.microsoft.com/office/word/2020/wordml/sdtdatahash" xmlns:w16sdtfl="http://schemas.microsoft.com/office/word/2024/wordml/sdtformatlock" xmlns:w16se="http://schemas.microsoft.com/office/word/2015/wordml/symex" xmlns:wpg="http://schemas.microsoft.com/office/word/2010/wordprocessingGroup" xmlns:wpi="http://schemas.microsoft.com/office/word/2010/wordprocessingInk" xmlns:wne="http://schemas.microsoft.com/office/word/2006/wordml" xmlns:wps="http://schemas.microsoft.com/office/word/2010/wordprocessingShape" mc:Ignorable="w14 w15 w16se w16cid w16 w16cex w16sdtdh w16sdtfl w16du wp14">
+<w:hdr xmlns:wpc="http://schemas.microsoft.com/office/word/2010/wordprocessingCanvas" xmlns:cx="http://schemas.microsoft.com/office/drawing/2014/chartex" xmlns:cx1="http://schemas.microsoft.com/office/drawing/2015/9/8/chartex" xmlns:cx2="http://schemas.microsoft.com/office/drawing/2015/10/21/chartex" xmlns:cx3="http://schemas.microsoft.com/office/drawing/2016/5/9/chartex" xmlns:cx4="http://schemas.microsoft.com/office/drawing/2016/5/10/chartex" xmlns:cx5="http://schemas.microsoft.com/office/drawing/2016/5/11/chartex" xmlns:cx6="http://schemas.microsoft.com/office/drawing/2016/5/12/chartex" xmlns:cx7="http://schemas.microsoft.com/office/drawing/2016/5/13/chartex" xmlns:cx8="http://schemas.microsoft.com/office/drawing/2016/5/14/chartex" xmlns:mc="http://schemas.openxmlformats.org/markup-compatibility/2006" xmlns:aink="http://schemas.microsoft.com/office/drawing/2016/ink" xmlns:am3d="http://schemas.microsoft.com/office/drawing/2017/model3d" xmlns:o="urn:schemas-microsoft-com:office:office" xmlns:r="http://schemas.openxmlformats.org/officeDocument/2006/relationships" xmlns:m="http://schemas.openxmlformats.org/officeDocument/2006/math" xmlns:v="urn:schemas-microsoft-com:vml" xmlns:wp14="http://schemas.microsoft.com/office/word/2010/wordprocessingDrawing" xmlns:wp="http://schemas.openxmlformats.org/drawingml/2006/wordprocessingDrawing" xmlns:w10="urn:schemas-microsoft-com:office:word" xmlns:w="http://schemas.openxmlformats.org/wordprocessingml/2006/main" xmlns:w14="http://schemas.microsoft.com/office/word/2010/wordml" xmlns:w15="http://schemas.microsoft.com/office/word/2012/wordml" xmlns:w16cid="http://schemas.microsoft.com/office/word/2016/wordml/cid" xmlns:w16se="http://schemas.microsoft.com/office/word/2015/wordml/symex" xmlns:wpg="http://schemas.microsoft.com/office/word/2010/wordprocessingGroup" xmlns:wpi="http://schemas.microsoft.com/office/word/2010/wordprocessingInk" xmlns:wne="http://schemas.microsoft.com/office/word/2006/wordml" xmlns:wps="http://schemas.microsoft.com/office/word/2010/wordprocessingShape" mc:Ignorable="w14 w15 w16se w16cid wp14">
   <w:p>
     <w:pPr>
       <w:pStyle w:val="Kopfzeile"/>
@@ -3708,7 +3819,7 @@
 </file>
 
 <file path=word/numbering.xml><?xml version="1.0" encoding="utf-8"?>
-<w:numbering xmlns:wpc="http://schemas.microsoft.com/office/word/2010/wordprocessingCanvas" xmlns:cx="http://schemas.microsoft.com/office/drawing/2014/chartex" xmlns:cx1="http://schemas.microsoft.com/office/drawing/2015/9/8/chartex" xmlns:cx2="http://schemas.microsoft.com/office/drawing/2015/10/21/chartex" xmlns:cx3="http://schemas.microsoft.com/office/drawing/2016/5/9/chartex" xmlns:cx4="http://schemas.microsoft.com/office/drawing/2016/5/10/chartex" xmlns:cx5="http://schemas.microsoft.com/office/drawing/2016/5/11/chartex" xmlns:cx6="http://schemas.microsoft.com/office/drawing/2016/5/12/chartex" xmlns:cx7="http://schemas.microsoft.com/office/drawing/2016/5/13/chartex" xmlns:cx8="http://schemas.microsoft.com/office/drawing/2016/5/14/chartex" xmlns:mc="http://schemas.openxmlformats.org/markup-compatibility/2006" xmlns:aink="http://schemas.microsoft.com/office/drawing/2016/ink" xmlns:am3d="http://schemas.microsoft.com/office/drawing/2017/model3d" xmlns:o="urn:schemas-microsoft-com:office:office" xmlns:oel="http://schemas.microsoft.com/office/2019/extlst" xmlns:r="http://schemas.openxmlformats.org/officeDocument/2006/relationships" xmlns:m="http://schemas.openxmlformats.org/officeDocument/2006/math" xmlns:v="urn:schemas-microsoft-com:vml" xmlns:wp14="http://schemas.microsoft.com/office/word/2010/wordprocessingDrawing" xmlns:wp="http://schemas.openxmlformats.org/drawingml/2006/wordprocessingDrawing" xmlns:w10="urn:schemas-microsoft-com:office:word" xmlns:w="http://schemas.openxmlformats.org/wordprocessingml/2006/main" xmlns:w14="http://schemas.microsoft.com/office/word/2010/wordml" xmlns:w15="http://schemas.microsoft.com/office/word/2012/wordml" xmlns:w16cex="http://schemas.microsoft.com/office/word/2018/wordml/cex" xmlns:w16cid="http://schemas.microsoft.com/office/word/2016/wordml/cid" xmlns:w16="http://schemas.microsoft.com/office/word/2018/wordml" xmlns:w16du="http://schemas.microsoft.com/office/word/2023/wordml/word16du" xmlns:w16sdtdh="http://schemas.microsoft.com/office/word/2020/wordml/sdtdatahash" xmlns:w16sdtfl="http://schemas.microsoft.com/office/word/2024/wordml/sdtformatlock" xmlns:w16se="http://schemas.microsoft.com/office/word/2015/wordml/symex" xmlns:wpg="http://schemas.microsoft.com/office/word/2010/wordprocessingGroup" xmlns:wpi="http://schemas.microsoft.com/office/word/2010/wordprocessingInk" xmlns:wne="http://schemas.microsoft.com/office/word/2006/wordml" xmlns:wps="http://schemas.microsoft.com/office/word/2010/wordprocessingShape" mc:Ignorable="w14 w15 w16se w16cid w16 w16cex w16sdtdh w16sdtfl w16du wp14">
+<w:numbering xmlns:wpc="http://schemas.microsoft.com/office/word/2010/wordprocessingCanvas" xmlns:cx="http://schemas.microsoft.com/office/drawing/2014/chartex" xmlns:cx1="http://schemas.microsoft.com/office/drawing/2015/9/8/chartex" xmlns:cx2="http://schemas.microsoft.com/office/drawing/2015/10/21/chartex" xmlns:cx3="http://schemas.microsoft.com/office/drawing/2016/5/9/chartex" xmlns:cx4="http://schemas.microsoft.com/office/drawing/2016/5/10/chartex" xmlns:cx5="http://schemas.microsoft.com/office/drawing/2016/5/11/chartex" xmlns:cx6="http://schemas.microsoft.com/office/drawing/2016/5/12/chartex" xmlns:cx7="http://schemas.microsoft.com/office/drawing/2016/5/13/chartex" xmlns:cx8="http://schemas.microsoft.com/office/drawing/2016/5/14/chartex" xmlns:mc="http://schemas.openxmlformats.org/markup-compatibility/2006" xmlns:aink="http://schemas.microsoft.com/office/drawing/2016/ink" xmlns:am3d="http://schemas.microsoft.com/office/drawing/2017/model3d" xmlns:o="urn:schemas-microsoft-com:office:office" xmlns:r="http://schemas.openxmlformats.org/officeDocument/2006/relationships" xmlns:m="http://schemas.openxmlformats.org/officeDocument/2006/math" xmlns:v="urn:schemas-microsoft-com:vml" xmlns:wp14="http://schemas.microsoft.com/office/word/2010/wordprocessingDrawing" xmlns:wp="http://schemas.openxmlformats.org/drawingml/2006/wordprocessingDrawing" xmlns:w10="urn:schemas-microsoft-com:office:word" xmlns:w="http://schemas.openxmlformats.org/wordprocessingml/2006/main" xmlns:w14="http://schemas.microsoft.com/office/word/2010/wordml" xmlns:w15="http://schemas.microsoft.com/office/word/2012/wordml" xmlns:w16cid="http://schemas.microsoft.com/office/word/2016/wordml/cid" xmlns:w16se="http://schemas.microsoft.com/office/word/2015/wordml/symex" xmlns:wpg="http://schemas.microsoft.com/office/word/2010/wordprocessingGroup" xmlns:wpi="http://schemas.microsoft.com/office/word/2010/wordprocessingInk" xmlns:wne="http://schemas.microsoft.com/office/word/2006/wordml" xmlns:wps="http://schemas.microsoft.com/office/word/2010/wordprocessingShape" mc:Ignorable="w14 w15 w16se w16cid wp14">
   <w:numPicBullet w:numPicBulletId="0">
     <w:pict>
       <v:shapetype id="_x0000_t75" coordsize="21600,21600" o:spt="75" o:preferrelative="t" path="m@4@5l@4@11@9@11@9@5xe" filled="f" stroked="f">
@@ -3730,7 +3841,7 @@
         <v:path o:extrusionok="f" gradientshapeok="t" o:connecttype="rect"/>
         <o:lock v:ext="edit" aspectratio="t"/>
       </v:shapetype>
-      <v:shape id="_x0000_i1025" type="#_x0000_t75" style="width:26.9pt;height:26.9pt;visibility:visible;mso-wrap-style:square" o:bullet="t">
+      <v:shape id="_x0000_i1028" type="#_x0000_t75" style="width:27.05pt;height:27.05pt;visibility:visible;mso-wrap-style:square" o:bullet="t">
         <v:imagedata r:id="rId1" o:title=""/>
       </v:shape>
     </w:pict>
@@ -4202,107 +4313,107 @@
       </w:rPr>
     </w:lvl>
   </w:abstractNum>
-  <w:num w:numId="1" w16cid:durableId="619453027">
+  <w:num w:numId="1">
     <w:abstractNumId w:val="9"/>
   </w:num>
-  <w:num w:numId="2" w16cid:durableId="2053915621">
+  <w:num w:numId="2">
     <w:abstractNumId w:val="7"/>
   </w:num>
-  <w:num w:numId="3" w16cid:durableId="952978690">
+  <w:num w:numId="3">
     <w:abstractNumId w:val="6"/>
   </w:num>
-  <w:num w:numId="4" w16cid:durableId="1495335857">
+  <w:num w:numId="4">
     <w:abstractNumId w:val="5"/>
   </w:num>
-  <w:num w:numId="5" w16cid:durableId="1427574713">
+  <w:num w:numId="5">
     <w:abstractNumId w:val="4"/>
   </w:num>
-  <w:num w:numId="6" w16cid:durableId="1102798152">
+  <w:num w:numId="6">
     <w:abstractNumId w:val="8"/>
   </w:num>
-  <w:num w:numId="7" w16cid:durableId="1507942619">
+  <w:num w:numId="7">
     <w:abstractNumId w:val="3"/>
   </w:num>
-  <w:num w:numId="8" w16cid:durableId="1604531421">
+  <w:num w:numId="8">
     <w:abstractNumId w:val="2"/>
   </w:num>
-  <w:num w:numId="9" w16cid:durableId="1218904863">
+  <w:num w:numId="9">
     <w:abstractNumId w:val="1"/>
   </w:num>
-  <w:num w:numId="10" w16cid:durableId="1458988900">
+  <w:num w:numId="10">
     <w:abstractNumId w:val="0"/>
   </w:num>
-  <w:num w:numId="11" w16cid:durableId="885683664">
+  <w:num w:numId="11">
     <w:abstractNumId w:val="9"/>
   </w:num>
-  <w:num w:numId="12" w16cid:durableId="999577156">
+  <w:num w:numId="12">
     <w:abstractNumId w:val="7"/>
   </w:num>
-  <w:num w:numId="13" w16cid:durableId="1791629182">
+  <w:num w:numId="13">
     <w:abstractNumId w:val="6"/>
   </w:num>
-  <w:num w:numId="14" w16cid:durableId="1898277428">
+  <w:num w:numId="14">
     <w:abstractNumId w:val="5"/>
   </w:num>
-  <w:num w:numId="15" w16cid:durableId="19085239">
+  <w:num w:numId="15">
     <w:abstractNumId w:val="4"/>
   </w:num>
-  <w:num w:numId="16" w16cid:durableId="460618349">
+  <w:num w:numId="16">
     <w:abstractNumId w:val="8"/>
   </w:num>
-  <w:num w:numId="17" w16cid:durableId="1815759107">
+  <w:num w:numId="17">
     <w:abstractNumId w:val="3"/>
   </w:num>
-  <w:num w:numId="18" w16cid:durableId="1255356252">
+  <w:num w:numId="18">
     <w:abstractNumId w:val="2"/>
   </w:num>
-  <w:num w:numId="19" w16cid:durableId="1727147445">
+  <w:num w:numId="19">
     <w:abstractNumId w:val="1"/>
   </w:num>
-  <w:num w:numId="20" w16cid:durableId="142940714">
+  <w:num w:numId="20">
     <w:abstractNumId w:val="0"/>
   </w:num>
-  <w:num w:numId="21" w16cid:durableId="910698325">
+  <w:num w:numId="21">
     <w:abstractNumId w:val="9"/>
   </w:num>
-  <w:num w:numId="22" w16cid:durableId="1480346202">
+  <w:num w:numId="22">
     <w:abstractNumId w:val="7"/>
   </w:num>
-  <w:num w:numId="23" w16cid:durableId="1924531861">
+  <w:num w:numId="23">
     <w:abstractNumId w:val="6"/>
   </w:num>
-  <w:num w:numId="24" w16cid:durableId="74326473">
+  <w:num w:numId="24">
     <w:abstractNumId w:val="5"/>
   </w:num>
-  <w:num w:numId="25" w16cid:durableId="548568561">
+  <w:num w:numId="25">
     <w:abstractNumId w:val="4"/>
   </w:num>
-  <w:num w:numId="26" w16cid:durableId="685255784">
+  <w:num w:numId="26">
     <w:abstractNumId w:val="8"/>
   </w:num>
-  <w:num w:numId="27" w16cid:durableId="415632088">
+  <w:num w:numId="27">
     <w:abstractNumId w:val="3"/>
   </w:num>
-  <w:num w:numId="28" w16cid:durableId="289627228">
+  <w:num w:numId="28">
     <w:abstractNumId w:val="2"/>
   </w:num>
-  <w:num w:numId="29" w16cid:durableId="2041934853">
+  <w:num w:numId="29">
     <w:abstractNumId w:val="1"/>
   </w:num>
-  <w:num w:numId="30" w16cid:durableId="1955282456">
+  <w:num w:numId="30">
     <w:abstractNumId w:val="0"/>
   </w:num>
-  <w:num w:numId="31" w16cid:durableId="1427264456">
+  <w:num w:numId="31">
     <w:abstractNumId w:val="10"/>
   </w:num>
-  <w:num w:numId="32" w16cid:durableId="1022173243">
+  <w:num w:numId="32">
     <w:abstractNumId w:val="11"/>
   </w:num>
 </w:numbering>
 </file>
 
 <file path=word/styles.xml><?xml version="1.0" encoding="utf-8"?>
-<w:styles xmlns:mc="http://schemas.openxmlformats.org/markup-compatibility/2006" xmlns:r="http://schemas.openxmlformats.org/officeDocument/2006/relationships" xmlns:w="http://schemas.openxmlformats.org/wordprocessingml/2006/main" xmlns:w14="http://schemas.microsoft.com/office/word/2010/wordml" xmlns:w15="http://schemas.microsoft.com/office/word/2012/wordml" xmlns:w16cex="http://schemas.microsoft.com/office/word/2018/wordml/cex" xmlns:w16cid="http://schemas.microsoft.com/office/word/2016/wordml/cid" xmlns:w16="http://schemas.microsoft.com/office/word/2018/wordml" xmlns:w16du="http://schemas.microsoft.com/office/word/2023/wordml/word16du" xmlns:w16sdtdh="http://schemas.microsoft.com/office/word/2020/wordml/sdtdatahash" xmlns:w16sdtfl="http://schemas.microsoft.com/office/word/2024/wordml/sdtformatlock" xmlns:w16se="http://schemas.microsoft.com/office/word/2015/wordml/symex" mc:Ignorable="w14 w15 w16se w16cid w16 w16cex w16sdtdh w16sdtfl w16du">
+<w:styles xmlns:mc="http://schemas.openxmlformats.org/markup-compatibility/2006" xmlns:r="http://schemas.openxmlformats.org/officeDocument/2006/relationships" xmlns:w="http://schemas.openxmlformats.org/wordprocessingml/2006/main" xmlns:w14="http://schemas.microsoft.com/office/word/2010/wordml" xmlns:w15="http://schemas.microsoft.com/office/word/2012/wordml" xmlns:w16cid="http://schemas.microsoft.com/office/word/2016/wordml/cid" xmlns:w16se="http://schemas.microsoft.com/office/word/2015/wordml/symex" mc:Ignorable="w14 w15 w16se w16cid">
   <w:docDefaults>
     <w:rPrDefault>
       <w:rPr>
@@ -4312,7 +4423,7 @@
     </w:rPrDefault>
     <w:pPrDefault/>
   </w:docDefaults>
-  <w:latentStyles w:defLockedState="0" w:defUIPriority="0" w:defSemiHidden="0" w:defUnhideWhenUsed="0" w:defQFormat="0" w:count="376">
+  <w:latentStyles w:defLockedState="0" w:defUIPriority="0" w:defSemiHidden="0" w:defUnhideWhenUsed="0" w:defQFormat="0" w:count="375">
     <w:lsdException w:name="Normal" w:qFormat="1"/>
     <w:lsdException w:name="heading 1" w:uiPriority="9" w:qFormat="1"/>
     <w:lsdException w:name="heading 2" w:uiPriority="9" w:qFormat="1"/>
@@ -4605,7 +4716,6 @@
     <w:lsdException w:name="Smart Hyperlink" w:semiHidden="1" w:uiPriority="99" w:unhideWhenUsed="1"/>
     <w:lsdException w:name="Hashtag" w:semiHidden="1" w:uiPriority="99" w:unhideWhenUsed="1"/>
     <w:lsdException w:name="Unresolved Mention" w:semiHidden="1" w:uiPriority="99" w:unhideWhenUsed="1"/>
-    <w:lsdException w:name="Smart Link" w:semiHidden="1" w:uiPriority="99" w:unhideWhenUsed="1"/>
   </w:latentStyles>
   <w:style w:type="paragraph" w:default="1" w:styleId="Standard">
     <w:name w:val="Normal"/>
@@ -6220,7 +6330,7 @@
 </file>
 
 <file path=customXml/itemProps1.xml><?xml version="1.0" encoding="utf-8"?>
-<ds:datastoreItem xmlns:ds="http://schemas.openxmlformats.org/officeDocument/2006/customXml" ds:itemID="{D90E6F82-29C1-46DA-9588-2B4126DFB63B}">
+<ds:datastoreItem xmlns:ds="http://schemas.openxmlformats.org/officeDocument/2006/customXml" ds:itemID="{D7F1E84F-73E6-4FE5-88DD-1C1711565B1C}">
   <ds:schemaRefs>
     <ds:schemaRef ds:uri="http://schemas.openxmlformats.org/officeDocument/2006/bibliography"/>
   </ds:schemaRefs>

</xml_diff>

<commit_message>
angepasst mit list of authors udn startseiten
</commit_message>
<xml_diff>
--- a/LNI-Startseiten.docx
+++ b/LNI-Startseiten.docx
@@ -9,6 +9,7 @@
           <w:lang w:val="de-AT"/>
         </w:rPr>
       </w:pPr>
+      <w:bookmarkStart w:id="0" w:name="_GoBack"/>
     </w:p>
     <w:p>
       <w:pPr>
@@ -780,7 +781,7 @@
                 <w:tab w:val="left" w:pos="142"/>
               </w:tabs>
             </w:pPr>
-            <w:bookmarkStart w:id="0" w:name="_Hlk187770951"/>
+            <w:bookmarkStart w:id="1" w:name="_Hlk187770951"/>
             <w:r>
               <w:rPr>
                 <w:kern w:val="2"/>
@@ -825,15 +826,6 @@
               </w:rPr>
               <w:t>Germany</w:t>
             </w:r>
-          </w:p>
-          <w:p>
-            <w:pPr>
-              <w:ind w:left="-106"/>
-              <w:rPr>
-                <w:kern w:val="2"/>
-                <w14:ligatures w14:val="standardContextual"/>
-              </w:rPr>
-            </w:pPr>
           </w:p>
         </w:tc>
       </w:tr>
@@ -874,7 +866,7 @@
                 <w:kern w:val="2"/>
                 <w14:ligatures w14:val="standardContextual"/>
               </w:rPr>
-              <w:t>Trier University of Applied Sciences, Trier, Germany</w:t>
+              <w:t>Trier University of Applied Sciences, Trier,</w:t>
             </w:r>
           </w:p>
           <w:p>
@@ -885,6 +877,20 @@
                 <w14:ligatures w14:val="standardContextual"/>
               </w:rPr>
             </w:pPr>
+            <w:r>
+              <w:rPr>
+                <w:kern w:val="2"/>
+                <w14:ligatures w14:val="standardContextual"/>
+              </w:rPr>
+              <w:t>G</w:t>
+            </w:r>
+            <w:r>
+              <w:rPr>
+                <w:kern w:val="2"/>
+                <w14:ligatures w14:val="standardContextual"/>
+              </w:rPr>
+              <w:t>ermany</w:t>
+            </w:r>
           </w:p>
         </w:tc>
       </w:tr>
@@ -925,7 +931,23 @@
                 <w:kern w:val="2"/>
                 <w14:ligatures w14:val="standardContextual"/>
               </w:rPr>
-              <w:t>University of Applied Sciences Bielefeld, Minden, Germany</w:t>
+              <w:t xml:space="preserve">University of Applied Sciences Bielefeld, Minden, </w:t>
+            </w:r>
+          </w:p>
+          <w:p>
+            <w:pPr>
+              <w:ind w:left="-106"/>
+              <w:rPr>
+                <w:kern w:val="2"/>
+                <w14:ligatures w14:val="standardContextual"/>
+              </w:rPr>
+            </w:pPr>
+            <w:r>
+              <w:rPr>
+                <w:kern w:val="2"/>
+                <w14:ligatures w14:val="standardContextual"/>
+              </w:rPr>
+              <w:t>Germany</w:t>
             </w:r>
           </w:p>
         </w:tc>
@@ -937,14 +959,6 @@
           </w:tcPr>
           <w:p>
             <w:pPr>
-              <w:rPr>
-                <w:kern w:val="2"/>
-                <w14:ligatures w14:val="standardContextual"/>
-              </w:rPr>
-            </w:pPr>
-          </w:p>
-          <w:p>
-            <w:pPr>
               <w:tabs>
                 <w:tab w:val="left" w:pos="142"/>
               </w:tabs>
@@ -988,6 +1002,45 @@
                 <w14:ligatures w14:val="standardContextual"/>
               </w:rPr>
             </w:pPr>
+            <w:r>
+              <w:rPr>
+                <w:kern w:val="2"/>
+                <w14:ligatures w14:val="standardContextual"/>
+              </w:rPr>
+              <w:t xml:space="preserve">University of </w:t>
+            </w:r>
+            <w:proofErr w:type="spellStart"/>
+            <w:r>
+              <w:rPr>
+                <w:kern w:val="2"/>
+                <w14:ligatures w14:val="standardContextual"/>
+              </w:rPr>
+              <w:t>Łódź</w:t>
+            </w:r>
+            <w:proofErr w:type="spellEnd"/>
+            <w:r>
+              <w:rPr>
+                <w:kern w:val="2"/>
+                <w14:ligatures w14:val="standardContextual"/>
+              </w:rPr>
+              <w:t xml:space="preserve">, </w:t>
+            </w:r>
+            <w:proofErr w:type="spellStart"/>
+            <w:r>
+              <w:rPr>
+                <w:kern w:val="2"/>
+                <w14:ligatures w14:val="standardContextual"/>
+              </w:rPr>
+              <w:t>Łódź</w:t>
+            </w:r>
+            <w:proofErr w:type="spellEnd"/>
+            <w:r>
+              <w:rPr>
+                <w:kern w:val="2"/>
+                <w14:ligatures w14:val="standardContextual"/>
+              </w:rPr>
+              <w:t xml:space="preserve">, </w:t>
+            </w:r>
           </w:p>
           <w:p>
             <w:pPr>
@@ -1002,44 +1055,12 @@
                 <w:kern w:val="2"/>
                 <w14:ligatures w14:val="standardContextual"/>
               </w:rPr>
-              <w:t xml:space="preserve">University of </w:t>
-            </w:r>
-            <w:proofErr w:type="spellStart"/>
-            <w:r>
-              <w:rPr>
-                <w:kern w:val="2"/>
-                <w14:ligatures w14:val="standardContextual"/>
-              </w:rPr>
-              <w:t>Łódź</w:t>
-            </w:r>
-            <w:proofErr w:type="spellEnd"/>
-            <w:r>
-              <w:rPr>
-                <w:kern w:val="2"/>
-                <w14:ligatures w14:val="standardContextual"/>
-              </w:rPr>
-              <w:t xml:space="preserve">, </w:t>
-            </w:r>
-            <w:proofErr w:type="spellStart"/>
-            <w:r>
-              <w:rPr>
-                <w:kern w:val="2"/>
-                <w14:ligatures w14:val="standardContextual"/>
-              </w:rPr>
-              <w:t>Łódź</w:t>
-            </w:r>
-            <w:proofErr w:type="spellEnd"/>
-            <w:r>
-              <w:rPr>
-                <w:kern w:val="2"/>
-                <w14:ligatures w14:val="standardContextual"/>
-              </w:rPr>
-              <w:t>, Poland</w:t>
+              <w:t>Poland</w:t>
             </w:r>
           </w:p>
         </w:tc>
       </w:tr>
-      <w:bookmarkEnd w:id="0"/>
+      <w:bookmarkEnd w:id="1"/>
     </w:tbl>
     <w:p>
       <w:pPr>
@@ -1059,37 +1080,17 @@
     <w:p>
       <w:pPr>
         <w:pStyle w:val="Textkrper-Einzug2"/>
-        <w:rPr>
-          <w:lang w:val="de-DE"/>
-        </w:rPr>
-      </w:pPr>
-      <w:r>
-        <w:rPr>
-          <w:lang w:val="de-DE"/>
-        </w:rPr>
+      </w:pPr>
+      <w:r>
         <w:t xml:space="preserve">Andreas </w:t>
       </w:r>
       <w:proofErr w:type="spellStart"/>
       <w:r>
-        <w:rPr>
-          <w:lang w:val="de-DE"/>
-        </w:rPr>
         <w:t>Oberweis</w:t>
       </w:r>
       <w:proofErr w:type="spellEnd"/>
       <w:r>
-        <w:rPr>
-          <w:lang w:val="de-DE"/>
-        </w:rPr>
-        <w:t xml:space="preserve">, KIT Karlsruhe, </w:t>
-      </w:r>
-      <w:bookmarkStart w:id="1" w:name="_GoBack"/>
-      <w:bookmarkEnd w:id="1"/>
-      <w:r>
-        <w:rPr>
-          <w:lang w:val="de-DE"/>
-        </w:rPr>
-        <w:t>(Chairman, andreas.oberweis@kit.edu)</w:t>
+        <w:t>, KIT Karlsruhe, (Chairman, andreas.oberweis@kit.edu)</w:t>
       </w:r>
     </w:p>
     <w:p>
@@ -1577,6 +1578,21 @@
           <w:lang w:val="en-GB"/>
         </w:rPr>
         <w:t>.</w:t>
+      </w:r>
+    </w:p>
+    <w:p>
+      <w:pPr>
+        <w:rPr>
+          <w:i/>
+          <w:lang w:val="en-GB"/>
+        </w:rPr>
+      </w:pPr>
+      <w:r>
+        <w:rPr>
+          <w:i/>
+          <w:lang w:val="en-GB"/>
+        </w:rPr>
+        <w:br w:type="page"/>
       </w:r>
     </w:p>
     <w:p>
@@ -2598,6 +2614,33 @@
               <w:t>Germany</w:t>
             </w:r>
           </w:p>
+        </w:tc>
+      </w:tr>
+      <w:tr>
+        <w:tc>
+          <w:tcPr>
+            <w:tcW w:w="2268" w:type="dxa"/>
+          </w:tcPr>
+          <w:p>
+            <w:pPr>
+              <w:rPr>
+                <w:kern w:val="2"/>
+                <w14:ligatures w14:val="standardContextual"/>
+              </w:rPr>
+            </w:pPr>
+            <w:r>
+              <w:rPr>
+                <w:kern w:val="2"/>
+                <w14:ligatures w14:val="standardContextual"/>
+              </w:rPr>
+              <w:t>Stefan Naumann</w:t>
+            </w:r>
+          </w:p>
+        </w:tc>
+        <w:tc>
+          <w:tcPr>
+            <w:tcW w:w="5245" w:type="dxa"/>
+          </w:tcPr>
           <w:p>
             <w:pPr>
               <w:ind w:left="-106"/>
@@ -2606,6 +2649,43 @@
                 <w14:ligatures w14:val="standardContextual"/>
               </w:rPr>
             </w:pPr>
+            <w:r>
+              <w:rPr>
+                <w:kern w:val="2"/>
+                <w14:ligatures w14:val="standardContextual"/>
+              </w:rPr>
+              <w:t>Trier University of Applied Sciences, Trier,</w:t>
+            </w:r>
+          </w:p>
+          <w:p>
+            <w:pPr>
+              <w:ind w:left="-106"/>
+              <w:rPr>
+                <w:kern w:val="2"/>
+                <w14:ligatures w14:val="standardContextual"/>
+              </w:rPr>
+            </w:pPr>
+            <w:r>
+              <w:rPr>
+                <w:kern w:val="2"/>
+                <w14:ligatures w14:val="standardContextual"/>
+              </w:rPr>
+              <w:t>G</w:t>
+            </w:r>
+            <w:r>
+              <w:rPr>
+                <w:kern w:val="2"/>
+                <w14:ligatures w14:val="standardContextual"/>
+              </w:rPr>
+              <w:t>ermany</w:t>
+            </w:r>
+            <w:r>
+              <w:rPr>
+                <w:kern w:val="2"/>
+                <w14:ligatures w14:val="standardContextual"/>
+              </w:rPr>
+              <w:t xml:space="preserve"> </w:t>
+            </w:r>
           </w:p>
         </w:tc>
       </w:tr>
@@ -2626,7 +2706,7 @@
                 <w:kern w:val="2"/>
                 <w14:ligatures w14:val="standardContextual"/>
               </w:rPr>
-              <w:t>Stefan Naumann</w:t>
+              <w:t>Grit Behrens</w:t>
             </w:r>
           </w:p>
         </w:tc>
@@ -2647,7 +2727,7 @@
                 <w:kern w:val="2"/>
                 <w14:ligatures w14:val="standardContextual"/>
               </w:rPr>
-              <w:t>Trier University of Applied Sciences, Trier, Germany</w:t>
+              <w:t xml:space="preserve">University of Applied Sciences Bielefeld, Minden, </w:t>
             </w:r>
           </w:p>
           <w:p>
@@ -2658,48 +2738,12 @@
                 <w14:ligatures w14:val="standardContextual"/>
               </w:rPr>
             </w:pPr>
-          </w:p>
-        </w:tc>
-      </w:tr>
-      <w:tr>
-        <w:tc>
-          <w:tcPr>
-            <w:tcW w:w="2268" w:type="dxa"/>
-          </w:tcPr>
-          <w:p>
-            <w:pPr>
+            <w:r>
               <w:rPr>
                 <w:kern w:val="2"/>
                 <w14:ligatures w14:val="standardContextual"/>
               </w:rPr>
-            </w:pPr>
-            <w:r>
-              <w:rPr>
-                <w:kern w:val="2"/>
-                <w14:ligatures w14:val="standardContextual"/>
-              </w:rPr>
-              <w:t>Grit Behrens</w:t>
-            </w:r>
-          </w:p>
-        </w:tc>
-        <w:tc>
-          <w:tcPr>
-            <w:tcW w:w="5245" w:type="dxa"/>
-          </w:tcPr>
-          <w:p>
-            <w:pPr>
-              <w:ind w:left="-106"/>
-              <w:rPr>
-                <w:kern w:val="2"/>
-                <w14:ligatures w14:val="standardContextual"/>
-              </w:rPr>
-            </w:pPr>
-            <w:r>
-              <w:rPr>
-                <w:kern w:val="2"/>
-                <w14:ligatures w14:val="standardContextual"/>
-              </w:rPr>
-              <w:t>University of Applied Sciences Bielefeld, Minden, Germany</w:t>
+              <w:t>Germany</w:t>
             </w:r>
           </w:p>
         </w:tc>
@@ -2719,14 +2763,6 @@
                 <w14:ligatures w14:val="standardContextual"/>
               </w:rPr>
             </w:pPr>
-          </w:p>
-          <w:p>
-            <w:pPr>
-              <w:rPr>
-                <w:kern w:val="2"/>
-                <w14:ligatures w14:val="standardContextual"/>
-              </w:rPr>
-            </w:pPr>
             <w:proofErr w:type="spellStart"/>
             <w:r>
               <w:rPr>
@@ -2766,6 +2802,45 @@
                 <w14:ligatures w14:val="standardContextual"/>
               </w:rPr>
             </w:pPr>
+            <w:r>
+              <w:rPr>
+                <w:kern w:val="2"/>
+                <w14:ligatures w14:val="standardContextual"/>
+              </w:rPr>
+              <w:t xml:space="preserve">University of </w:t>
+            </w:r>
+            <w:proofErr w:type="spellStart"/>
+            <w:r>
+              <w:rPr>
+                <w:kern w:val="2"/>
+                <w14:ligatures w14:val="standardContextual"/>
+              </w:rPr>
+              <w:t>Łódź</w:t>
+            </w:r>
+            <w:proofErr w:type="spellEnd"/>
+            <w:r>
+              <w:rPr>
+                <w:kern w:val="2"/>
+                <w14:ligatures w14:val="standardContextual"/>
+              </w:rPr>
+              <w:t xml:space="preserve">, </w:t>
+            </w:r>
+            <w:proofErr w:type="spellStart"/>
+            <w:r>
+              <w:rPr>
+                <w:kern w:val="2"/>
+                <w14:ligatures w14:val="standardContextual"/>
+              </w:rPr>
+              <w:t>Łódź</w:t>
+            </w:r>
+            <w:proofErr w:type="spellEnd"/>
+            <w:r>
+              <w:rPr>
+                <w:kern w:val="2"/>
+                <w14:ligatures w14:val="standardContextual"/>
+              </w:rPr>
+              <w:t xml:space="preserve">, </w:t>
+            </w:r>
           </w:p>
           <w:p>
             <w:pPr>
@@ -2780,39 +2855,7 @@
                 <w:kern w:val="2"/>
                 <w14:ligatures w14:val="standardContextual"/>
               </w:rPr>
-              <w:t xml:space="preserve">University of </w:t>
-            </w:r>
-            <w:proofErr w:type="spellStart"/>
-            <w:r>
-              <w:rPr>
-                <w:kern w:val="2"/>
-                <w14:ligatures w14:val="standardContextual"/>
-              </w:rPr>
-              <w:t>Łódź</w:t>
-            </w:r>
-            <w:proofErr w:type="spellEnd"/>
-            <w:r>
-              <w:rPr>
-                <w:kern w:val="2"/>
-                <w14:ligatures w14:val="standardContextual"/>
-              </w:rPr>
-              <w:t xml:space="preserve">, </w:t>
-            </w:r>
-            <w:proofErr w:type="spellStart"/>
-            <w:r>
-              <w:rPr>
-                <w:kern w:val="2"/>
-                <w14:ligatures w14:val="standardContextual"/>
-              </w:rPr>
-              <w:t>Łódź</w:t>
-            </w:r>
-            <w:proofErr w:type="spellEnd"/>
-            <w:r>
-              <w:rPr>
-                <w:kern w:val="2"/>
-                <w14:ligatures w14:val="standardContextual"/>
-              </w:rPr>
-              <w:t>, Poland</w:t>
+              <w:t>Poland</w:t>
             </w:r>
           </w:p>
         </w:tc>
@@ -3336,17 +3379,13 @@
         </w:tabs>
       </w:pPr>
     </w:p>
-    <w:p>
-      <w:pPr>
-        <w:tabs>
-          <w:tab w:val="left" w:pos="142"/>
-        </w:tabs>
-      </w:pPr>
-    </w:p>
     <w:tbl>
       <w:tblPr>
         <w:tblW w:w="0" w:type="auto"/>
         <w:tblCellSpacing w:w="15" w:type="dxa"/>
+        <w:tblBorders>
+          <w:bottom w:val="single" w:sz="4" w:space="0" w:color="auto"/>
+        </w:tblBorders>
         <w:tblCellMar>
           <w:top w:w="15" w:type="dxa"/>
           <w:left w:w="15" w:type="dxa"/>
@@ -3356,8 +3395,8 @@
         <w:tblLook w:val="04A0" w:firstRow="1" w:lastRow="0" w:firstColumn="1" w:lastColumn="0" w:noHBand="0" w:noVBand="1"/>
       </w:tblPr>
       <w:tblGrid>
-        <w:gridCol w:w="1843"/>
-        <w:gridCol w:w="5301"/>
+        <w:gridCol w:w="2268"/>
+        <w:gridCol w:w="4876"/>
       </w:tblGrid>
       <w:tr>
         <w:trPr>
@@ -3367,8 +3406,7 @@
         </w:trPr>
         <w:tc>
           <w:tcPr>
-            <w:tcW w:w="1798" w:type="dxa"/>
-            <w:vAlign w:val="center"/>
+            <w:tcW w:w="2223" w:type="dxa"/>
           </w:tcPr>
           <w:p>
             <w:pPr>
@@ -3388,15 +3426,11 @@
         </w:tc>
         <w:tc>
           <w:tcPr>
-            <w:tcW w:w="5256" w:type="dxa"/>
-            <w:vAlign w:val="center"/>
+            <w:tcW w:w="4831" w:type="dxa"/>
           </w:tcPr>
           <w:p>
             <w:pPr>
               <w:rPr>
-                <w:b/>
-                <w:bCs/>
-                <w:sz w:val="24"/>
                 <w:szCs w:val="24"/>
               </w:rPr>
             </w:pPr>
@@ -3404,7 +3438,20 @@
               <w:rPr>
                 <w:szCs w:val="24"/>
               </w:rPr>
-              <w:t>HTW Berlin – University of Applied Sciences, Berlin, Germany</w:t>
+              <w:t xml:space="preserve">HTW Berlin – University of Applied Sciences, Berlin, </w:t>
+            </w:r>
+          </w:p>
+          <w:p>
+            <w:pPr>
+              <w:rPr>
+                <w:szCs w:val="24"/>
+              </w:rPr>
+            </w:pPr>
+            <w:r>
+              <w:rPr>
+                <w:szCs w:val="24"/>
+              </w:rPr>
+              <w:t>Germany</w:t>
             </w:r>
           </w:p>
         </w:tc>
@@ -3416,8 +3463,7 @@
         </w:trPr>
         <w:tc>
           <w:tcPr>
-            <w:tcW w:w="1798" w:type="dxa"/>
-            <w:vAlign w:val="center"/>
+            <w:tcW w:w="2223" w:type="dxa"/>
           </w:tcPr>
           <w:p>
             <w:pPr>
@@ -3437,8 +3483,7 @@
         </w:tc>
         <w:tc>
           <w:tcPr>
-            <w:tcW w:w="5256" w:type="dxa"/>
-            <w:vAlign w:val="center"/>
+            <w:tcW w:w="4831" w:type="dxa"/>
           </w:tcPr>
           <w:p>
             <w:pPr>
@@ -3450,7 +3495,33 @@
               <w:rPr>
                 <w:szCs w:val="24"/>
               </w:rPr>
-              <w:t>University of Applied Sciences Bielefeld, Germany</w:t>
+              <w:t xml:space="preserve">University of Applied Sciences Bielefeld, </w:t>
+            </w:r>
+            <w:r>
+              <w:rPr>
+                <w:kern w:val="2"/>
+                <w14:ligatures w14:val="standardContextual"/>
+              </w:rPr>
+              <w:t>Minden</w:t>
+            </w:r>
+            <w:r>
+              <w:rPr>
+                <w:szCs w:val="24"/>
+              </w:rPr>
+              <w:t>,</w:t>
+            </w:r>
+          </w:p>
+          <w:p>
+            <w:pPr>
+              <w:rPr>
+                <w:szCs w:val="24"/>
+              </w:rPr>
+            </w:pPr>
+            <w:r>
+              <w:rPr>
+                <w:szCs w:val="24"/>
+              </w:rPr>
+              <w:t>Germany</w:t>
             </w:r>
           </w:p>
         </w:tc>
@@ -3462,8 +3533,7 @@
         </w:trPr>
         <w:tc>
           <w:tcPr>
-            <w:tcW w:w="1798" w:type="dxa"/>
-            <w:vAlign w:val="center"/>
+            <w:tcW w:w="2223" w:type="dxa"/>
           </w:tcPr>
           <w:p>
             <w:pPr>
@@ -3501,8 +3571,7 @@
         </w:tc>
         <w:tc>
           <w:tcPr>
-            <w:tcW w:w="5256" w:type="dxa"/>
-            <w:vAlign w:val="center"/>
+            <w:tcW w:w="4831" w:type="dxa"/>
           </w:tcPr>
           <w:p>
             <w:pPr>
@@ -3542,7 +3611,20 @@
               <w:rPr>
                 <w:szCs w:val="24"/>
               </w:rPr>
-              <w:t>, Poland</w:t>
+              <w:t xml:space="preserve">, </w:t>
+            </w:r>
+          </w:p>
+          <w:p>
+            <w:pPr>
+              <w:rPr>
+                <w:szCs w:val="24"/>
+              </w:rPr>
+            </w:pPr>
+            <w:r>
+              <w:rPr>
+                <w:szCs w:val="24"/>
+              </w:rPr>
+              <w:t>Poland</w:t>
             </w:r>
           </w:p>
         </w:tc>
@@ -3554,8 +3636,7 @@
         </w:trPr>
         <w:tc>
           <w:tcPr>
-            <w:tcW w:w="1798" w:type="dxa"/>
-            <w:vAlign w:val="center"/>
+            <w:tcW w:w="2223" w:type="dxa"/>
           </w:tcPr>
           <w:p>
             <w:pPr>
@@ -3575,8 +3656,7 @@
         </w:tc>
         <w:tc>
           <w:tcPr>
-            <w:tcW w:w="5256" w:type="dxa"/>
-            <w:vAlign w:val="center"/>
+            <w:tcW w:w="4831" w:type="dxa"/>
           </w:tcPr>
           <w:p>
             <w:pPr>
@@ -3588,7 +3668,13 @@
               <w:rPr>
                 <w:szCs w:val="24"/>
               </w:rPr>
-              <w:t>Trier University of Applied Sciences, Germany</w:t>
+              <w:t xml:space="preserve">Trier University of Applied Sciences, </w:t>
+            </w:r>
+            <w:r>
+              <w:rPr>
+                <w:szCs w:val="24"/>
+              </w:rPr>
+              <w:t>Trier,</w:t>
             </w:r>
           </w:p>
           <w:p>
@@ -3597,6 +3683,12 @@
                 <w:szCs w:val="24"/>
               </w:rPr>
             </w:pPr>
+            <w:r>
+              <w:rPr>
+                <w:szCs w:val="24"/>
+              </w:rPr>
+              <w:t>Germany</w:t>
+            </w:r>
           </w:p>
         </w:tc>
       </w:tr>
@@ -3607,8 +3699,7 @@
         </w:trPr>
         <w:tc>
           <w:tcPr>
-            <w:tcW w:w="1798" w:type="dxa"/>
-            <w:vAlign w:val="center"/>
+            <w:tcW w:w="2223" w:type="dxa"/>
           </w:tcPr>
           <w:p>
             <w:pPr>
@@ -3628,8 +3719,7 @@
         </w:tc>
         <w:tc>
           <w:tcPr>
-            <w:tcW w:w="5256" w:type="dxa"/>
-            <w:vAlign w:val="center"/>
+            <w:tcW w:w="4831" w:type="dxa"/>
           </w:tcPr>
           <w:p>
             <w:pPr>
@@ -3641,7 +3731,20 @@
               <w:rPr>
                 <w:szCs w:val="24"/>
               </w:rPr>
-              <w:t>HTW Berlin – University of Applied Sciences, Berlin, Germany</w:t>
+              <w:t xml:space="preserve">HTW Berlin – University of Applied Sciences, Berlin, </w:t>
+            </w:r>
+          </w:p>
+          <w:p>
+            <w:pPr>
+              <w:rPr>
+                <w:szCs w:val="24"/>
+              </w:rPr>
+            </w:pPr>
+            <w:r>
+              <w:rPr>
+                <w:szCs w:val="24"/>
+              </w:rPr>
+              <w:t>Germany</w:t>
             </w:r>
           </w:p>
         </w:tc>
@@ -3657,6 +3760,7 @@
       <w:r>
         <w:t xml:space="preserve"> </w:t>
       </w:r>
+      <w:bookmarkEnd w:id="0"/>
     </w:p>
     <w:sectPr>
       <w:headerReference w:type="first" r:id="rId14"/>
@@ -3841,7 +3945,7 @@
         <v:path o:extrusionok="f" gradientshapeok="t" o:connecttype="rect"/>
         <o:lock v:ext="edit" aspectratio="t"/>
       </v:shapetype>
-      <v:shape id="_x0000_i1028" type="#_x0000_t75" style="width:27.05pt;height:27.05pt;visibility:visible;mso-wrap-style:square" o:bullet="t">
+      <v:shape id="_x0000_i1032" type="#_x0000_t75" style="width:27.15pt;height:27.15pt;visibility:visible;mso-wrap-style:square" o:bullet="t">
         <v:imagedata r:id="rId1" o:title=""/>
       </v:shape>
     </w:pict>
@@ -6330,7 +6434,7 @@
 </file>
 
 <file path=customXml/itemProps1.xml><?xml version="1.0" encoding="utf-8"?>
-<ds:datastoreItem xmlns:ds="http://schemas.openxmlformats.org/officeDocument/2006/customXml" ds:itemID="{D7F1E84F-73E6-4FE5-88DD-1C1711565B1C}">
+<ds:datastoreItem xmlns:ds="http://schemas.openxmlformats.org/officeDocument/2006/customXml" ds:itemID="{E530663E-A89B-4D6C-B52E-894FC6117969}">
   <ds:schemaRefs>
     <ds:schemaRef ds:uri="http://schemas.openxmlformats.org/officeDocument/2006/bibliography"/>
   </ds:schemaRefs>

</xml_diff>